<commit_message>
Add Quality Policy and set both policies to single-page DAN format
Rebuild both DAN policies in the house style with the policy statement,
commitments and CEO signature together on one content page (Table of Contents
and revision-history pages suppressed via a one-page template mode):

- Quality Policy (DAN-IMS-POL-001) — new; ISO 9001:2015; Prepared by Mashhour
  Shaqroun (Quality Manager), Reviewed by Amjed Sammari (Delivery Director),
  Approved/signed by CEO Abdulrahman Aba Alkhail. Registered.
- HSE & Welfare Policy (DAN-IMS-POL-002) — reformatted to the same one-page
  layout, CEO signatory.

Both carry the branded cover (logo, brand band, Document Control, named
Approval), Tahoma throughout; content preserved. Validated.

Co-Authored-By: Claude Opus 4.8 <noreply@anthropic.com>
Claude-Session: https://claude.ai/code/session_01Gkd3K8tDngLcQLDrM4dcJc
</commit_message>
<xml_diff>
--- a/New HSSE Management System 2026/02-Leadership/DAN-IMS-POL-002__Jun_2026_HSE_and_Welfare_Policy.docx
+++ b/New HSSE Management System 2026/02-Leadership/DAN-IMS-POL-002__Jun_2026_HSE_and_Welfare_Policy.docx
@@ -959,156 +959,28 @@
     </w:p>
     <w:p>
       <w:pPr>
-        <w:spacing w:after="160"/>
-      </w:pPr>
-      <w:r>
-        <w:rPr>
-          <w:rFonts w:ascii="Tahoma" w:cs="Tahoma" w:eastAsia="Tahoma" w:hAnsi="Tahoma"/>
-          <w:b/>
-          <w:bCs/>
-          <w:color w:val="542A12"/>
-          <w:sz w:val="28"/>
-          <w:szCs w:val="28"/>
-        </w:rPr>
-        <w:t xml:space="preserve">Table of Contents</w:t>
-      </w:r>
-    </w:p>
-    <w:sdt>
-      <w:sdtPr>
-        <w:alias w:val="Table of Contents"/>
-      </w:sdtPr>
-      <w:sdtContent>
-        <w:p>
-          <w:r>
-            <w:fldChar w:fldCharType="begin" w:dirty="true"/>
-            <w:instrText xml:space="preserve">TOC \h \o "1-2"</w:instrText>
-            <w:fldChar w:fldCharType="separate"/>
-          </w:r>
-        </w:p>
-        <w:p>
-          <w:pPr>
-            <w:spacing w:after="40" w:line="259"/>
-            <w:ind w:left="0"/>
-          </w:pPr>
-          <w:hyperlink w:anchor="_DanToc9000" w:history="1">
-            <w:r>
-              <w:rPr>
-                <w:rFonts w:ascii="Tahoma" w:hAnsi="Tahoma" w:cs="Tahoma"/>
-                <w:b/>
-                <w:color w:val="542A12"/>
-                <w:sz w:val="20"/>
-              </w:rPr>
-              <w:t xml:space="preserve">Policy Statement</w:t>
-            </w:r>
-          </w:hyperlink>
-        </w:p>
-        <w:p>
-          <w:pPr>
-            <w:spacing w:after="40" w:line="259"/>
-            <w:ind w:left="0"/>
-          </w:pPr>
-          <w:hyperlink w:anchor="_DanToc9001" w:history="1">
-            <w:r>
-              <w:rPr>
-                <w:rFonts w:ascii="Tahoma" w:hAnsi="Tahoma" w:cs="Tahoma"/>
-                <w:b/>
-                <w:color w:val="542A12"/>
-                <w:sz w:val="20"/>
-              </w:rPr>
-              <w:t xml:space="preserve">Our HSE &amp; Welfare Commitments</w:t>
-            </w:r>
-          </w:hyperlink>
-        </w:p>
-        <w:p>
-          <w:pPr>
-            <w:spacing w:after="40" w:line="259"/>
-            <w:ind w:left="0"/>
-          </w:pPr>
-          <w:hyperlink w:anchor="_DanToc9002" w:history="1">
-            <w:r>
-              <w:rPr>
-                <w:rFonts w:ascii="Tahoma" w:hAnsi="Tahoma" w:cs="Tahoma"/>
-                <w:b/>
-                <w:color w:val="542A12"/>
-                <w:sz w:val="20"/>
-              </w:rPr>
-              <w:t xml:space="preserve">Implementation, Review and Communication</w:t>
-            </w:r>
-          </w:hyperlink>
-        </w:p>
-        <w:p>
-          <w:pPr>
-            <w:spacing w:after="40" w:line="259"/>
-            <w:ind w:left="0"/>
-          </w:pPr>
-          <w:hyperlink w:anchor="_DanToc9003" w:history="1">
-            <w:r>
-              <w:rPr>
-                <w:rFonts w:ascii="Tahoma" w:hAnsi="Tahoma" w:cs="Tahoma"/>
-                <w:b/>
-                <w:color w:val="542A12"/>
-                <w:sz w:val="20"/>
-              </w:rPr>
-              <w:t xml:space="preserve">Revision History</w:t>
-            </w:r>
-          </w:hyperlink>
-        </w:p>
-        <w:p>
-          <w:r>
-            <w:fldChar w:fldCharType="end"/>
-          </w:r>
-        </w:p>
-      </w:sdtContent>
-    </w:sdt>
-    <w:p>
-      <w:r>
-        <w:br w:type="page"/>
-      </w:r>
-    </w:p>
-    <w:p>
-      <w:pPr>
-        <w:pStyle w:val="Heading1"/>
-      </w:pPr>
-      <w:bookmarkStart w:id="9000" w:name="_DanToc9000"/>
-      <w:r>
-        <w:t xml:space="preserve">Policy Statement</w:t>
-      </w:r>
-      <w:bookmarkEnd w:id="9000"/>
-    </w:p>
-    <w:p>
-      <w:pPr>
-        <w:spacing w:after="120" w:line="276"/>
+        <w:spacing w:after="100" w:line="252"/>
         <w:jc w:val="both"/>
       </w:pPr>
       <w:r>
         <w:rPr>
           <w:rFonts w:ascii="Tahoma" w:cs="Tahoma" w:eastAsia="Tahoma" w:hAnsi="Tahoma"/>
-          <w:sz w:val="20"/>
-          <w:szCs w:val="20"/>
+          <w:sz w:val="19"/>
+          <w:szCs w:val="19"/>
         </w:rPr>
         <w:t xml:space="preserve">DAN Company is committed to delivering its services in a manner that protects the health, safety and welfare of employees, contractors, and stakeholders, while safeguarding the environment. Through the continual improvement of our processes, services, and management systems, we aim to achieve our objectives in accordance with internationally recognized standards, including ISO 14001:2015 and ISO 45001:2018, ensuring sustainable performance, compliance, and operational excellence.</w:t>
       </w:r>
     </w:p>
     <w:p>
       <w:pPr>
-        <w:pStyle w:val="Heading1"/>
-      </w:pPr>
-      <w:bookmarkStart w:id="9001" w:name="_DanToc9001"/>
-      <w:r>
-        <w:t xml:space="preserve">Our HSE &amp; Welfare Commitments</w:t>
-      </w:r>
-      <w:bookmarkEnd w:id="9001"/>
-    </w:p>
-    <w:p>
-      <w:pPr>
-        <w:spacing w:after="120" w:line="276"/>
+        <w:spacing w:after="100" w:line="252"/>
         <w:jc w:val="both"/>
       </w:pPr>
       <w:r>
         <w:rPr>
           <w:rFonts w:ascii="Tahoma" w:cs="Tahoma" w:eastAsia="Tahoma" w:hAnsi="Tahoma"/>
-          <w:sz w:val="20"/>
-          <w:szCs w:val="20"/>
+          <w:sz w:val="19"/>
+          <w:szCs w:val="19"/>
         </w:rPr>
         <w:t xml:space="preserve">Through this policy, we affirm our commitment to fully implement the health, safety and environmental management systems and ensure compliance with their requirements. This includes our commitment to:</w:t>
       </w:r>
@@ -1120,14 +992,14 @@
           <w:ilvl w:val="0"/>
           <w:numId w:val="2"/>
         </w:numPr>
-        <w:spacing w:after="60" w:line="268"/>
+        <w:spacing w:after="40" w:line="246"/>
         <w:jc w:val="both"/>
       </w:pPr>
       <w:r>
         <w:rPr>
           <w:rFonts w:ascii="Tahoma" w:cs="Tahoma" w:eastAsia="Tahoma" w:hAnsi="Tahoma"/>
-          <w:sz w:val="20"/>
-          <w:szCs w:val="20"/>
+          <w:sz w:val="19"/>
+          <w:szCs w:val="19"/>
         </w:rPr>
         <w:t xml:space="preserve">Comply with all laws and regulations and adopt international best practices when local laws are insufficient.</w:t>
       </w:r>
@@ -1139,16 +1011,16 @@
           <w:ilvl w:val="0"/>
           <w:numId w:val="2"/>
         </w:numPr>
-        <w:spacing w:after="60" w:line="268"/>
+        <w:spacing w:after="40" w:line="246"/>
         <w:jc w:val="both"/>
       </w:pPr>
       <w:r>
         <w:rPr>
           <w:rFonts w:ascii="Tahoma" w:cs="Tahoma" w:eastAsia="Tahoma" w:hAnsi="Tahoma"/>
-          <w:sz w:val="20"/>
-          <w:szCs w:val="20"/>
-        </w:rPr>
-        <w:t xml:space="preserve">Ensure that employees will receive the necessary equipment, information, training, and supervision to meet policy objectives.</w:t>
+          <w:sz w:val="19"/>
+          <w:szCs w:val="19"/>
+        </w:rPr>
+        <w:t xml:space="preserve">Ensure that employees receive the necessary equipment, information, training, and supervision to meet policy objectives.</w:t>
       </w:r>
     </w:p>
     <w:p>
@@ -1158,14 +1030,14 @@
           <w:ilvl w:val="0"/>
           <w:numId w:val="2"/>
         </w:numPr>
-        <w:spacing w:after="60" w:line="268"/>
+        <w:spacing w:after="40" w:line="246"/>
         <w:jc w:val="both"/>
       </w:pPr>
       <w:r>
         <w:rPr>
           <w:rFonts w:ascii="Tahoma" w:cs="Tahoma" w:eastAsia="Tahoma" w:hAnsi="Tahoma"/>
-          <w:sz w:val="20"/>
-          <w:szCs w:val="20"/>
+          <w:sz w:val="19"/>
+          <w:szCs w:val="19"/>
         </w:rPr>
         <w:t xml:space="preserve">Provide adequate resources to address health and safety needs.</w:t>
       </w:r>
@@ -1177,14 +1049,14 @@
           <w:ilvl w:val="0"/>
           <w:numId w:val="2"/>
         </w:numPr>
-        <w:spacing w:after="60" w:line="268"/>
+        <w:spacing w:after="40" w:line="246"/>
         <w:jc w:val="both"/>
       </w:pPr>
       <w:r>
         <w:rPr>
           <w:rFonts w:ascii="Tahoma" w:cs="Tahoma" w:eastAsia="Tahoma" w:hAnsi="Tahoma"/>
-          <w:sz w:val="20"/>
-          <w:szCs w:val="20"/>
+          <w:sz w:val="19"/>
+          <w:szCs w:val="19"/>
         </w:rPr>
         <w:t xml:space="preserve">Encourage active employee participation in health and safety matters, promoting communication and shared responsibility for well-being.</w:t>
       </w:r>
@@ -1196,14 +1068,14 @@
           <w:ilvl w:val="0"/>
           <w:numId w:val="2"/>
         </w:numPr>
-        <w:spacing w:after="60" w:line="268"/>
+        <w:spacing w:after="40" w:line="246"/>
         <w:jc w:val="both"/>
       </w:pPr>
       <w:r>
         <w:rPr>
           <w:rFonts w:ascii="Tahoma" w:cs="Tahoma" w:eastAsia="Tahoma" w:hAnsi="Tahoma"/>
-          <w:sz w:val="20"/>
-          <w:szCs w:val="20"/>
+          <w:sz w:val="19"/>
+          <w:szCs w:val="19"/>
         </w:rPr>
         <w:t xml:space="preserve">Ensure that all workplace injuries, no matter how minor, are reported immediately.</w:t>
       </w:r>
@@ -1215,14 +1087,14 @@
           <w:ilvl w:val="0"/>
           <w:numId w:val="2"/>
         </w:numPr>
-        <w:spacing w:after="60" w:line="268"/>
+        <w:spacing w:after="40" w:line="246"/>
         <w:jc w:val="both"/>
       </w:pPr>
       <w:r>
         <w:rPr>
           <w:rFonts w:ascii="Tahoma" w:cs="Tahoma" w:eastAsia="Tahoma" w:hAnsi="Tahoma"/>
-          <w:sz w:val="20"/>
-          <w:szCs w:val="20"/>
+          <w:sz w:val="19"/>
+          <w:szCs w:val="19"/>
         </w:rPr>
         <w:t xml:space="preserve">Provide accurate and detailed records of incidents that are vital for monitoring and updating the health and safety management system.</w:t>
       </w:r>
@@ -1234,14 +1106,14 @@
           <w:ilvl w:val="0"/>
           <w:numId w:val="2"/>
         </w:numPr>
-        <w:spacing w:after="60" w:line="268"/>
+        <w:spacing w:after="40" w:line="246"/>
         <w:jc w:val="both"/>
       </w:pPr>
       <w:r>
         <w:rPr>
           <w:rFonts w:ascii="Tahoma" w:cs="Tahoma" w:eastAsia="Tahoma" w:hAnsi="Tahoma"/>
-          <w:sz w:val="20"/>
-          <w:szCs w:val="20"/>
+          <w:sz w:val="19"/>
+          <w:szCs w:val="19"/>
         </w:rPr>
         <w:t xml:space="preserve">Ensure that employees follow the health, safety and environmental policy, with disciplinary action for non-compliance.</w:t>
       </w:r>
@@ -1253,16 +1125,16 @@
           <w:ilvl w:val="0"/>
           <w:numId w:val="2"/>
         </w:numPr>
-        <w:spacing w:after="60" w:line="268"/>
+        <w:spacing w:after="40" w:line="246"/>
         <w:jc w:val="both"/>
       </w:pPr>
       <w:r>
         <w:rPr>
           <w:rFonts w:ascii="Tahoma" w:cs="Tahoma" w:eastAsia="Tahoma" w:hAnsi="Tahoma"/>
-          <w:sz w:val="20"/>
-          <w:szCs w:val="20"/>
-        </w:rPr>
-        <w:t xml:space="preserve">Provide and maintain adequate welfare facilities — including clean drinking water, sanitation, washing and rest areas, hygienic eating facilities and, where applicable, suitable worker accommodation — and manage these facilities responsibly to reduce water, energy and waste impacts.</w:t>
+          <w:sz w:val="19"/>
+          <w:szCs w:val="19"/>
+        </w:rPr>
+        <w:t xml:space="preserve">Provide and maintain adequate welfare facilities — clean drinking water, sanitation, washing and rest areas, hygienic eating facilities and, where applicable, suitable worker accommodation — and manage them responsibly to reduce water, energy and waste impacts.</w:t>
       </w:r>
     </w:p>
     <w:p>
@@ -1272,16 +1144,16 @@
           <w:ilvl w:val="0"/>
           <w:numId w:val="2"/>
         </w:numPr>
-        <w:spacing w:after="60" w:line="268"/>
+        <w:spacing w:after="40" w:line="246"/>
         <w:jc w:val="both"/>
       </w:pPr>
       <w:r>
         <w:rPr>
           <w:rFonts w:ascii="Tahoma" w:cs="Tahoma" w:eastAsia="Tahoma" w:hAnsi="Tahoma"/>
-          <w:sz w:val="20"/>
-          <w:szCs w:val="20"/>
-        </w:rPr>
-        <w:t xml:space="preserve">Safeguard the physical and mental well-being of our workforce by managing occupational health, hygiene, heat stress, fatigue and psychosocial risks, and by providing access to first aid and occupational-health support.</w:t>
+          <w:sz w:val="19"/>
+          <w:szCs w:val="19"/>
+        </w:rPr>
+        <w:t xml:space="preserve">Safeguard the physical and mental well-being of our workforce by managing occupational health, hygiene, heat stress, fatigue and psychosocial risks, and providing access to first aid and occupational-health support.</w:t>
       </w:r>
     </w:p>
     <w:p>
@@ -1291,14 +1163,14 @@
           <w:ilvl w:val="0"/>
           <w:numId w:val="2"/>
         </w:numPr>
-        <w:spacing w:after="60" w:line="268"/>
+        <w:spacing w:after="40" w:line="246"/>
         <w:jc w:val="both"/>
       </w:pPr>
       <w:r>
         <w:rPr>
           <w:rFonts w:ascii="Tahoma" w:cs="Tahoma" w:eastAsia="Tahoma" w:hAnsi="Tahoma"/>
-          <w:sz w:val="20"/>
-          <w:szCs w:val="20"/>
+          <w:sz w:val="19"/>
+          <w:szCs w:val="19"/>
         </w:rPr>
         <w:t xml:space="preserve">Promote a respectful and inclusive workplace, free from harassment and discrimination, that supports worker welfare, well-being and a healthy work-life balance.</w:t>
       </w:r>
@@ -1310,14 +1182,14 @@
           <w:ilvl w:val="0"/>
           <w:numId w:val="2"/>
         </w:numPr>
-        <w:spacing w:after="60" w:line="268"/>
+        <w:spacing w:after="40" w:line="246"/>
         <w:jc w:val="both"/>
       </w:pPr>
       <w:r>
         <w:rPr>
           <w:rFonts w:ascii="Tahoma" w:cs="Tahoma" w:eastAsia="Tahoma" w:hAnsi="Tahoma"/>
-          <w:sz w:val="20"/>
-          <w:szCs w:val="20"/>
+          <w:sz w:val="19"/>
+          <w:szCs w:val="19"/>
         </w:rPr>
         <w:t xml:space="preserve">Consult and actively involve workers and their representatives in matters affecting their health, safety, welfare and well-being.</w:t>
       </w:r>
@@ -1329,379 +1201,77 @@
           <w:ilvl w:val="0"/>
           <w:numId w:val="2"/>
         </w:numPr>
-        <w:spacing w:after="60" w:line="268"/>
+        <w:spacing w:after="40" w:line="246"/>
         <w:jc w:val="both"/>
       </w:pPr>
       <w:r>
         <w:rPr>
           <w:rFonts w:ascii="Tahoma" w:cs="Tahoma" w:eastAsia="Tahoma" w:hAnsi="Tahoma"/>
-          <w:sz w:val="20"/>
-          <w:szCs w:val="20"/>
+          <w:sz w:val="19"/>
+          <w:szCs w:val="19"/>
         </w:rPr>
         <w:t xml:space="preserve">Pursue continual improvement in health, safety and environment, and update the management system as needed.</w:t>
       </w:r>
     </w:p>
     <w:p>
       <w:pPr>
-        <w:pStyle w:val="Heading1"/>
-      </w:pPr>
-      <w:bookmarkStart w:id="9002" w:name="_DanToc9002"/>
-      <w:r>
-        <w:t xml:space="preserve">Implementation, Review and Communication</w:t>
-      </w:r>
-      <w:bookmarkEnd w:id="9002"/>
-    </w:p>
-    <w:p>
-      <w:pPr>
-        <w:spacing w:after="120" w:line="276"/>
+        <w:spacing w:after="100" w:line="252"/>
         <w:jc w:val="both"/>
       </w:pPr>
       <w:r>
         <w:rPr>
           <w:rFonts w:ascii="Tahoma" w:cs="Tahoma" w:eastAsia="Tahoma" w:hAnsi="Tahoma"/>
-          <w:sz w:val="20"/>
-          <w:szCs w:val="20"/>
+          <w:sz w:val="19"/>
+          <w:szCs w:val="19"/>
         </w:rPr>
         <w:t xml:space="preserve">This policy demonstrates our strong commitment to health, safety and environmental management systems. It will be regularly reviewed and updated to stay effective and relevant. The policy will be communicated to all employees, contractors, and stakeholders to ensure a unified commitment to achieving our objectives.</w:t>
       </w:r>
     </w:p>
     <w:p>
       <w:pPr>
-        <w:spacing w:after="60"/>
-      </w:pPr>
-      <w:r>
-        <w:rPr>
-          <w:sz w:val="2"/>
-          <w:szCs w:val="2"/>
-        </w:rPr>
-        <w:t xml:space="preserve"/>
-      </w:r>
-    </w:p>
-    <w:p>
-      <w:pPr>
-        <w:keepNext/>
-        <w:spacing w:after="80" w:before="160"/>
+        <w:spacing w:after="20" w:before="160"/>
       </w:pPr>
       <w:r>
         <w:rPr>
           <w:rFonts w:ascii="Tahoma" w:cs="Tahoma" w:eastAsia="Tahoma" w:hAnsi="Tahoma"/>
           <w:b/>
           <w:bCs/>
-          <w:color w:val="B5692B"/>
-          <w:sz w:val="20"/>
-          <w:szCs w:val="20"/>
+          <w:color w:val="542A12"/>
+          <w:sz w:val="19"/>
+          <w:szCs w:val="19"/>
         </w:rPr>
         <w:t xml:space="preserve">Signed for and on behalf of DAN Company</w:t>
       </w:r>
     </w:p>
     <w:p>
       <w:pPr>
-        <w:spacing w:after="120" w:line="276"/>
-        <w:jc w:val="both"/>
-      </w:pPr>
-      <w:r>
-        <w:rPr>
-          <w:rFonts w:ascii="Tahoma" w:cs="Tahoma" w:eastAsia="Tahoma" w:hAnsi="Tahoma"/>
-          <w:sz w:val="20"/>
-          <w:szCs w:val="20"/>
+        <w:spacing w:after="0" w:line="264"/>
+      </w:pPr>
+      <w:r>
+        <w:rPr>
+          <w:rFonts w:ascii="Tahoma" w:cs="Tahoma" w:eastAsia="Tahoma" w:hAnsi="Tahoma"/>
+          <w:b/>
+          <w:bCs/>
+          <w:sz w:val="19"/>
+          <w:szCs w:val="19"/>
         </w:rPr>
         <w:t xml:space="preserve">Abdulrahman Aba Alkhail  —  Chief Executive Officer</w:t>
       </w:r>
     </w:p>
     <w:p>
       <w:pPr>
-        <w:spacing w:after="120" w:line="276"/>
-        <w:jc w:val="both"/>
-      </w:pPr>
-      <w:r>
-        <w:rPr>
-          <w:rFonts w:ascii="Tahoma" w:cs="Tahoma" w:eastAsia="Tahoma" w:hAnsi="Tahoma"/>
-          <w:sz w:val="20"/>
-          <w:szCs w:val="20"/>
+        <w:spacing w:before="60"/>
+      </w:pPr>
+      <w:r>
+        <w:rPr>
+          <w:rFonts w:ascii="Tahoma" w:cs="Tahoma" w:eastAsia="Tahoma" w:hAnsi="Tahoma"/>
+          <w:color w:val="555555"/>
+          <w:sz w:val="18"/>
+          <w:szCs w:val="18"/>
         </w:rPr>
         <w:t xml:space="preserve">Signature: ____________________          Date: 01 June 2026</w:t>
       </w:r>
     </w:p>
-    <w:p>
-      <w:pPr>
-        <w:pStyle w:val="Heading1"/>
-      </w:pPr>
-      <w:bookmarkStart w:id="9003" w:name="_DanToc9003"/>
-      <w:r>
-        <w:t xml:space="preserve">Revision History</w:t>
-      </w:r>
-      <w:bookmarkEnd w:id="9003"/>
-    </w:p>
-    <w:tbl>
-      <w:tblPr>
-        <w:tblW w:type="dxa" w:w="9360"/>
-        <w:tblBorders>
-          <w:top w:val="single" w:color="auto" w:sz="4"/>
-          <w:left w:val="single" w:color="auto" w:sz="4"/>
-          <w:bottom w:val="single" w:color="auto" w:sz="4"/>
-          <w:right w:val="single" w:color="auto" w:sz="4"/>
-          <w:insideH w:val="single" w:color="auto" w:sz="4"/>
-          <w:insideV w:val="single" w:color="auto" w:sz="4"/>
-        </w:tblBorders>
-      </w:tblPr>
-      <w:tblGrid>
-        <w:gridCol w:w="1000"/>
-        <w:gridCol w:w="1500"/>
-        <w:gridCol w:w="4460"/>
-        <w:gridCol w:w="2400"/>
-      </w:tblGrid>
-      <w:tr>
-        <w:trPr>
-          <w:tblHeader/>
-        </w:trPr>
-        <w:tc>
-          <w:tcPr>
-            <w:tcW w:type="dxa" w:w="1000"/>
-            <w:tcBorders>
-              <w:top w:val="single" w:color="BFB3AA" w:sz="4"/>
-              <w:left w:val="single" w:color="BFB3AA" w:sz="4"/>
-              <w:bottom w:val="single" w:color="BFB3AA" w:sz="4"/>
-              <w:right w:val="single" w:color="BFB3AA" w:sz="4"/>
-            </w:tcBorders>
-            <w:shd w:fill="542A12" w:color="auto" w:val="clear"/>
-            <w:tcMar>
-              <w:top w:type="dxa" w:w="60"/>
-              <w:left w:type="dxa" w:w="120"/>
-              <w:bottom w:type="dxa" w:w="60"/>
-              <w:right w:type="dxa" w:w="120"/>
-            </w:tcMar>
-            <w:vAlign w:val="center"/>
-          </w:tcPr>
-          <w:p>
-            <w:r>
-              <w:rPr>
-                <w:rFonts w:ascii="Tahoma" w:cs="Tahoma" w:eastAsia="Tahoma" w:hAnsi="Tahoma"/>
-                <w:b/>
-                <w:bCs/>
-                <w:color w:val="FFFFFF"/>
-                <w:sz w:val="18"/>
-                <w:szCs w:val="18"/>
-              </w:rPr>
-              <w:t xml:space="preserve">Rev.</w:t>
-            </w:r>
-          </w:p>
-        </w:tc>
-        <w:tc>
-          <w:tcPr>
-            <w:tcW w:type="dxa" w:w="1500"/>
-            <w:tcBorders>
-              <w:top w:val="single" w:color="BFB3AA" w:sz="4"/>
-              <w:left w:val="single" w:color="BFB3AA" w:sz="4"/>
-              <w:bottom w:val="single" w:color="BFB3AA" w:sz="4"/>
-              <w:right w:val="single" w:color="BFB3AA" w:sz="4"/>
-            </w:tcBorders>
-            <w:shd w:fill="542A12" w:color="auto" w:val="clear"/>
-            <w:tcMar>
-              <w:top w:type="dxa" w:w="60"/>
-              <w:left w:type="dxa" w:w="120"/>
-              <w:bottom w:type="dxa" w:w="60"/>
-              <w:right w:type="dxa" w:w="120"/>
-            </w:tcMar>
-            <w:vAlign w:val="center"/>
-          </w:tcPr>
-          <w:p>
-            <w:r>
-              <w:rPr>
-                <w:rFonts w:ascii="Tahoma" w:cs="Tahoma" w:eastAsia="Tahoma" w:hAnsi="Tahoma"/>
-                <w:b/>
-                <w:bCs/>
-                <w:color w:val="FFFFFF"/>
-                <w:sz w:val="18"/>
-                <w:szCs w:val="18"/>
-              </w:rPr>
-              <w:t xml:space="preserve">Date</w:t>
-            </w:r>
-          </w:p>
-        </w:tc>
-        <w:tc>
-          <w:tcPr>
-            <w:tcW w:type="dxa" w:w="4460"/>
-            <w:tcBorders>
-              <w:top w:val="single" w:color="BFB3AA" w:sz="4"/>
-              <w:left w:val="single" w:color="BFB3AA" w:sz="4"/>
-              <w:bottom w:val="single" w:color="BFB3AA" w:sz="4"/>
-              <w:right w:val="single" w:color="BFB3AA" w:sz="4"/>
-            </w:tcBorders>
-            <w:shd w:fill="542A12" w:color="auto" w:val="clear"/>
-            <w:tcMar>
-              <w:top w:type="dxa" w:w="60"/>
-              <w:left w:type="dxa" w:w="120"/>
-              <w:bottom w:type="dxa" w:w="60"/>
-              <w:right w:type="dxa" w:w="120"/>
-            </w:tcMar>
-            <w:vAlign w:val="center"/>
-          </w:tcPr>
-          <w:p>
-            <w:r>
-              <w:rPr>
-                <w:rFonts w:ascii="Tahoma" w:cs="Tahoma" w:eastAsia="Tahoma" w:hAnsi="Tahoma"/>
-                <w:b/>
-                <w:bCs/>
-                <w:color w:val="FFFFFF"/>
-                <w:sz w:val="18"/>
-                <w:szCs w:val="18"/>
-              </w:rPr>
-              <w:t xml:space="preserve">Description of Change</w:t>
-            </w:r>
-          </w:p>
-        </w:tc>
-        <w:tc>
-          <w:tcPr>
-            <w:tcW w:type="dxa" w:w="2400"/>
-            <w:tcBorders>
-              <w:top w:val="single" w:color="BFB3AA" w:sz="4"/>
-              <w:left w:val="single" w:color="BFB3AA" w:sz="4"/>
-              <w:bottom w:val="single" w:color="BFB3AA" w:sz="4"/>
-              <w:right w:val="single" w:color="BFB3AA" w:sz="4"/>
-            </w:tcBorders>
-            <w:shd w:fill="542A12" w:color="auto" w:val="clear"/>
-            <w:tcMar>
-              <w:top w:type="dxa" w:w="60"/>
-              <w:left w:type="dxa" w:w="120"/>
-              <w:bottom w:type="dxa" w:w="60"/>
-              <w:right w:type="dxa" w:w="120"/>
-            </w:tcMar>
-            <w:vAlign w:val="center"/>
-          </w:tcPr>
-          <w:p>
-            <w:r>
-              <w:rPr>
-                <w:rFonts w:ascii="Tahoma" w:cs="Tahoma" w:eastAsia="Tahoma" w:hAnsi="Tahoma"/>
-                <w:b/>
-                <w:bCs/>
-                <w:color w:val="FFFFFF"/>
-                <w:sz w:val="18"/>
-                <w:szCs w:val="18"/>
-              </w:rPr>
-              <w:t xml:space="preserve">Approved By</w:t>
-            </w:r>
-          </w:p>
-        </w:tc>
-      </w:tr>
-      <w:tr>
-        <w:tc>
-          <w:tcPr>
-            <w:tcW w:type="dxa" w:w="1000"/>
-            <w:tcBorders>
-              <w:top w:val="single" w:color="BFB3AA" w:sz="4"/>
-              <w:left w:val="single" w:color="BFB3AA" w:sz="4"/>
-              <w:bottom w:val="single" w:color="BFB3AA" w:sz="4"/>
-              <w:right w:val="single" w:color="BFB3AA" w:sz="4"/>
-            </w:tcBorders>
-            <w:tcMar>
-              <w:top w:type="dxa" w:w="60"/>
-              <w:left w:type="dxa" w:w="120"/>
-              <w:bottom w:type="dxa" w:w="60"/>
-              <w:right w:type="dxa" w:w="120"/>
-            </w:tcMar>
-            <w:vAlign w:val="center"/>
-          </w:tcPr>
-          <w:p>
-            <w:r>
-              <w:rPr>
-                <w:rFonts w:ascii="Tahoma" w:cs="Tahoma" w:eastAsia="Tahoma" w:hAnsi="Tahoma"/>
-                <w:color w:val="222222"/>
-                <w:sz w:val="18"/>
-                <w:szCs w:val="18"/>
-              </w:rPr>
-              <w:t xml:space="preserve">R01</w:t>
-            </w:r>
-          </w:p>
-        </w:tc>
-        <w:tc>
-          <w:tcPr>
-            <w:tcW w:type="dxa" w:w="1500"/>
-            <w:tcBorders>
-              <w:top w:val="single" w:color="BFB3AA" w:sz="4"/>
-              <w:left w:val="single" w:color="BFB3AA" w:sz="4"/>
-              <w:bottom w:val="single" w:color="BFB3AA" w:sz="4"/>
-              <w:right w:val="single" w:color="BFB3AA" w:sz="4"/>
-            </w:tcBorders>
-            <w:tcMar>
-              <w:top w:type="dxa" w:w="60"/>
-              <w:left w:type="dxa" w:w="120"/>
-              <w:bottom w:type="dxa" w:w="60"/>
-              <w:right w:type="dxa" w:w="120"/>
-            </w:tcMar>
-            <w:vAlign w:val="center"/>
-          </w:tcPr>
-          <w:p>
-            <w:r>
-              <w:rPr>
-                <w:rFonts w:ascii="Tahoma" w:cs="Tahoma" w:eastAsia="Tahoma" w:hAnsi="Tahoma"/>
-                <w:color w:val="222222"/>
-                <w:sz w:val="18"/>
-                <w:szCs w:val="18"/>
-              </w:rPr>
-              <w:t xml:space="preserve">June 2026</w:t>
-            </w:r>
-          </w:p>
-        </w:tc>
-        <w:tc>
-          <w:tcPr>
-            <w:tcW w:type="dxa" w:w="4460"/>
-            <w:tcBorders>
-              <w:top w:val="single" w:color="BFB3AA" w:sz="4"/>
-              <w:left w:val="single" w:color="BFB3AA" w:sz="4"/>
-              <w:bottom w:val="single" w:color="BFB3AA" w:sz="4"/>
-              <w:right w:val="single" w:color="BFB3AA" w:sz="4"/>
-            </w:tcBorders>
-            <w:tcMar>
-              <w:top w:type="dxa" w:w="60"/>
-              <w:left w:type="dxa" w:w="120"/>
-              <w:bottom w:type="dxa" w:w="60"/>
-              <w:right w:type="dxa" w:w="120"/>
-            </w:tcMar>
-            <w:vAlign w:val="center"/>
-          </w:tcPr>
-          <w:p>
-            <w:r>
-              <w:rPr>
-                <w:rFonts w:ascii="Tahoma" w:cs="Tahoma" w:eastAsia="Tahoma" w:hAnsi="Tahoma"/>
-                <w:color w:val="222222"/>
-                <w:sz w:val="18"/>
-                <w:szCs w:val="18"/>
-              </w:rPr>
-              <w:t xml:space="preserve">HSE &amp; Welfare Policy issued and made active (effective 01.06.2026); welfare, worker well-being, inclusion and worker-consultation commitments included.</w:t>
-            </w:r>
-          </w:p>
-        </w:tc>
-        <w:tc>
-          <w:tcPr>
-            <w:tcW w:type="dxa" w:w="2400"/>
-            <w:tcBorders>
-              <w:top w:val="single" w:color="BFB3AA" w:sz="4"/>
-              <w:left w:val="single" w:color="BFB3AA" w:sz="4"/>
-              <w:bottom w:val="single" w:color="BFB3AA" w:sz="4"/>
-              <w:right w:val="single" w:color="BFB3AA" w:sz="4"/>
-            </w:tcBorders>
-            <w:tcMar>
-              <w:top w:type="dxa" w:w="60"/>
-              <w:left w:type="dxa" w:w="120"/>
-              <w:bottom w:type="dxa" w:w="60"/>
-              <w:right w:type="dxa" w:w="120"/>
-            </w:tcMar>
-            <w:vAlign w:val="center"/>
-          </w:tcPr>
-          <w:p>
-            <w:r>
-              <w:rPr>
-                <w:rFonts w:ascii="Tahoma" w:cs="Tahoma" w:eastAsia="Tahoma" w:hAnsi="Tahoma"/>
-                <w:color w:val="222222"/>
-                <w:sz w:val="18"/>
-                <w:szCs w:val="18"/>
-              </w:rPr>
-              <w:t xml:space="preserve">Chief Executive Officer</w:t>
-            </w:r>
-          </w:p>
-        </w:tc>
-      </w:tr>
-    </w:tbl>
     <w:sectPr>
       <w:headerReference w:type="default" r:id="rId7"/>
       <w:footerReference w:type="default" r:id="rId8"/>

</xml_diff>